<commit_message>
docs(fase2): portada con logo DUOC, encabezado y ajustes de diseno (TSK-DOCS-003)
Portada rediseñada (logo institucional DUOC UC, regla, caja de integrantes), encabezado con logo en cada pagina y estilos de portada. Regenera .docx, .pdf y la fuente .md. refs TSK-DOCS-003
</commit_message>
<xml_diff>
--- a/docs-evidencia/informe-avance-fase2/Informe_Avance_Proyecto_APT_Fase2.docx
+++ b/docs-evidencia/informe-avance-fase2/Informe_Avance_Proyecto_APT_Fase2.docx
@@ -4,11 +4,100 @@
   <w:body>
     <w:p>
       <w:pPr>
-        <w:pStyle w:val="CoverTitle"/>
-      </w:pPr>
-      <w:r>
-        <w:rPr/>
-        <w:t xml:space="preserve">DUOC UC</w:t>
+        <w:jc w:val="center"/>
+        <w:spacing w:before="0" w:after="160"/>
+      </w:pPr>
+      <w:r>
+        <w:drawing>
+          <wp:inline xmlns:wp="http://schemas.openxmlformats.org/drawingml/2006/wordprocessingDrawing" distT="0" distB="0" distL="0" distR="0">
+            <wp:extent cx="2400000" cy="537265"/>
+            <wp:effectExtent l="0" t="0" r="0" b="0"/>
+            <wp:docPr id="1" name="logo-duoc"/>
+            <wp:cNvGraphicFramePr>
+              <a:graphicFrameLocks xmlns:a="http://schemas.openxmlformats.org/drawingml/2006/main" noChangeAspect="1"/>
+            </wp:cNvGraphicFramePr>
+            <a:graphic xmlns:a="http://schemas.openxmlformats.org/drawingml/2006/main">
+              <a:graphicData uri="http://schemas.openxmlformats.org/drawingml/2006/picture">
+                <pic:pic xmlns:pic="http://schemas.openxmlformats.org/drawingml/2006/picture">
+                  <pic:nvPicPr>
+                    <pic:cNvPr id="1" name="logo-duoc"/>
+                    <pic:cNvPicPr/>
+                  </pic:nvPicPr>
+                  <pic:blipFill>
+                    <a:blip r:embed="rId10"/>
+                    <a:stretch>
+                      <a:fillRect/>
+                    </a:stretch>
+                  </pic:blipFill>
+                  <pic:spPr>
+                    <a:xfrm>
+                      <a:off x="0" y="0"/>
+                      <a:ext cx="2400000" cy="537265"/>
+                    </a:xfrm>
+                    <a:prstGeom prst="rect">
+                      <a:avLst/>
+                    </a:prstGeom>
+                  </pic:spPr>
+                </pic:pic>
+              </a:graphicData>
+            </a:graphic>
+          </wp:inline>
+        </w:drawing>
+      </w:r>
+    </w:p>
+    <w:p>
+      <w:pPr>
+        <w:pStyle w:val="CoverLine"/>
+      </w:pPr>
+      <w:r>
+        <w:rPr/>
+        <w:t xml:space="preserve">ESCUELA DE INFORMÁTICA Y TELECOMUNICACIONES</w:t>
+      </w:r>
+    </w:p>
+    <w:p>
+      <w:pPr>
+        <w:pStyle w:val="CoverLine"/>
+      </w:pPr>
+      <w:r>
+        <w:rPr/>
+        <w:t xml:space="preserve">INGENIERÍA EN INFORMÁTICA · Sede Alameda</w:t>
+      </w:r>
+    </w:p>
+    <w:p>
+      <w:pPr>
+        <w:pStyle w:val="CoverLine"/>
+      </w:pPr>
+      <w:r>
+        <w:rPr/>
+        <w:t xml:space="preserve">Asignatura: Capstone (PTY4614)</w:t>
+      </w:r>
+    </w:p>
+    <w:p>
+      <w:pPr>
+        <w:jc w:val="center"/>
+        <w:ind w:left="1700" w:right="1700"/>
+        <w:spacing w:before="80" w:after="80"/>
+        <w:pBdr>
+          <w:bottom w:val="single" w:sz="8" w:space="1" w:color="2E5496"/>
+        </w:pBdr>
+      </w:pPr>
+    </w:p>
+    <w:p>
+      <w:pPr>
+        <w:pStyle w:val="CoverDoc"/>
+      </w:pPr>
+      <w:r>
+        <w:rPr/>
+        <w:t xml:space="preserve">INFORME DE AVANCE</w:t>
+      </w:r>
+    </w:p>
+    <w:p>
+      <w:pPr>
+        <w:pStyle w:val="CoverDoc"/>
+      </w:pPr>
+      <w:r>
+        <w:rPr/>
+        <w:t xml:space="preserve">PROYECTO APT — FASE 2</w:t>
       </w:r>
     </w:p>
     <w:p>
@@ -17,140 +106,105 @@
       </w:pPr>
       <w:r>
         <w:rPr/>
-        <w:t xml:space="preserve">Escuela de Informática y Telecomunicaciones</w:t>
-      </w:r>
-    </w:p>
+        <w:t xml:space="preserve">“Terreno Conectado, Decisiones en Tiempo Real”</w:t>
+      </w:r>
+    </w:p>
+    <w:p>
+      <w:pPr>
+        <w:pStyle w:val="CoverTagline"/>
+      </w:pPr>
+      <w:r>
+        <w:rPr/>
+        <w:t xml:space="preserve">Datos al día, donde no hay señal.</w:t>
+      </w:r>
+    </w:p>
+    <w:tbl>
+      <w:tblPr>
+        <w:tblW w:w="6400" w:type="dxa"/>
+        <w:jc w:val="center"/>
+        <w:tblBorders>
+          <w:top w:val="single" w:sz="4" w:space="0" w:color="B4C6E7"/>
+          <w:left w:val="single" w:sz="4" w:space="0" w:color="B4C6E7"/>
+          <w:bottom w:val="single" w:sz="4" w:space="0" w:color="B4C6E7"/>
+          <w:right w:val="single" w:sz="4" w:space="0" w:color="B4C6E7"/>
+        </w:tblBorders>
+        <w:tblCellMar>
+          <w:top w:w="140" w:type="dxa"/>
+          <w:left w:w="200" w:type="dxa"/>
+          <w:bottom w:w="140" w:type="dxa"/>
+          <w:right w:w="200" w:type="dxa"/>
+        </w:tblCellMar>
+      </w:tblPr>
+      <w:tblGrid>
+        <w:gridCol w:w="6400"/>
+      </w:tblGrid>
+      <w:tr>
+        <w:tc>
+          <w:tcPr>
+            <w:tcW w:w="6400" w:type="dxa"/>
+            <w:shd w:val="clear" w:color="auto" w:fill="DEEAF6"/>
+            <w:vAlign w:val="center"/>
+          </w:tcPr>
+          <w:p>
+            <w:pPr>
+              <w:jc w:val="center"/>
+              <w:spacing w:before="20" w:after="20" w:line="276" w:lineRule="auto"/>
+            </w:pPr>
+            <w:r>
+              <w:rPr>
+                <w:b/>
+              </w:rPr>
+              <w:t xml:space="preserve">Integrantes</w:t>
+            </w:r>
+          </w:p>
+          <w:p>
+            <w:pPr>
+              <w:jc w:val="center"/>
+              <w:spacing w:before="20" w:after="20" w:line="276" w:lineRule="auto"/>
+            </w:pPr>
+            <w:r>
+              <w:rPr/>
+              <w:t xml:space="preserve">Daniel Ávila — RUT: 21.256.327-7</w:t>
+            </w:r>
+          </w:p>
+          <w:p>
+            <w:pPr>
+              <w:jc w:val="center"/>
+              <w:spacing w:before="20" w:after="20" w:line="276" w:lineRule="auto"/>
+            </w:pPr>
+            <w:r>
+              <w:rPr/>
+              <w:t xml:space="preserve">Raúl González — RUT: 21.357.918-5</w:t>
+            </w:r>
+          </w:p>
+          <w:p>
+            <w:pPr>
+              <w:jc w:val="center"/>
+              <w:spacing w:before="20" w:after="20" w:line="276" w:lineRule="auto"/>
+            </w:pPr>
+            <w:r>
+              <w:rPr>
+                <w:b/>
+              </w:rPr>
+              <w:t xml:space="preserve">Docente:</w:t>
+            </w:r>
+            <w:r>
+              <w:rPr/>
+              <w:t xml:space="preserve"> Carlos Herrera</w:t>
+            </w:r>
+          </w:p>
+        </w:tc>
+      </w:tr>
+    </w:tbl>
+    <w:p/>
+    <w:p/>
     <w:p>
       <w:pPr>
         <w:pStyle w:val="CoverLine"/>
       </w:pPr>
       <w:r>
         <w:rPr/>
-        <w:t xml:space="preserve">Ingeniería en Informática</w:t>
-      </w:r>
-    </w:p>
-    <w:p>
-      <w:pPr>
-        <w:pStyle w:val="CoverLine"/>
-      </w:pPr>
-      <w:r>
-        <w:rPr/>
-        <w:t xml:space="preserve">Asignatura: Capstone (PTY4614)</w:t>
-      </w:r>
-    </w:p>
-    <w:p>
-      <w:pPr>
-        <w:pStyle w:val="CoverDoc"/>
-      </w:pPr>
-      <w:r>
-        <w:rPr/>
-        <w:t xml:space="preserve">INFORME DE AVANCE</w:t>
-      </w:r>
-    </w:p>
-    <w:p>
-      <w:pPr>
-        <w:pStyle w:val="CoverDoc"/>
-      </w:pPr>
-      <w:r>
-        <w:rPr/>
-        <w:t xml:space="preserve">PROYECTO APT — FASE 2</w:t>
-      </w:r>
-    </w:p>
-    <w:p>
-      <w:pPr>
-        <w:pStyle w:val="CoverLine"/>
-      </w:pPr>
-      <w:r>
-        <w:rPr>
-          <w:b/>
-        </w:rPr>
-        <w:t xml:space="preserve">“Terreno Conectado, Decisiones en Tiempo Real”</w:t>
-      </w:r>
-    </w:p>
-    <w:p>
-      <w:pPr>
-        <w:pStyle w:val="CoverLine"/>
-      </w:pPr>
-      <w:r>
-        <w:rPr>
-          <w:i/>
-        </w:rPr>
-        <w:t xml:space="preserve">Datos al día, donde no hay señal.</w:t>
-      </w:r>
-    </w:p>
-    <w:p>
-      <w:pPr>
-        <w:pStyle w:val="CoverLine"/>
-      </w:pPr>
-      <w:r>
-        <w:rPr/>
-        <w:t xml:space="preserve">Integrantes:</w:t>
-      </w:r>
-    </w:p>
-    <w:p>
-      <w:pPr>
-        <w:pStyle w:val="CoverLine"/>
-      </w:pPr>
-      <w:r>
-        <w:rPr>
-          <w:b/>
-        </w:rPr>
-        <w:t xml:space="preserve">Daniel Ávila</w:t>
-      </w:r>
-      <w:r>
-        <w:rPr/>
-        <w:t xml:space="preserve"> — RUT: 21.256.327-7</w:t>
-      </w:r>
-    </w:p>
-    <w:p>
-      <w:pPr>
-        <w:pStyle w:val="CoverLine"/>
-      </w:pPr>
-      <w:r>
-        <w:rPr>
-          <w:b/>
-        </w:rPr>
-        <w:t xml:space="preserve">Raúl González</w:t>
-      </w:r>
-      <w:r>
-        <w:rPr/>
-        <w:t xml:space="preserve"> — RUT: 21.357.918-5</w:t>
-      </w:r>
-    </w:p>
-    <w:p>
-      <w:pPr>
-        <w:pStyle w:val="CoverLine"/>
-      </w:pPr>
-      <w:r>
-        <w:rPr/>
-        <w:t xml:space="preserve">Carrera: Ingeniería en Informática</w:t>
-      </w:r>
-    </w:p>
-    <w:p>
-      <w:pPr>
-        <w:pStyle w:val="CoverLine"/>
-      </w:pPr>
-      <w:r>
-        <w:rPr/>
-        <w:t xml:space="preserve">Sede: Alameda</w:t>
-      </w:r>
-    </w:p>
-    <w:p>
-      <w:pPr>
-        <w:pStyle w:val="CoverLine"/>
-      </w:pPr>
-      <w:r>
-        <w:rPr/>
-        <w:t xml:space="preserve">Docente: Carlos Herrera</w:t>
-      </w:r>
-    </w:p>
-    <w:p>
-      <w:pPr>
-        <w:pStyle w:val="CoverLine"/>
-      </w:pPr>
-      <w:r>
-        <w:rPr/>
-        <w:t xml:space="preserve">Santiago de Chile, octubre de 2026</w:t>
+        <w:t xml:space="preserve">Santiago de Chile · octubre de 2026</w:t>
       </w:r>
     </w:p>
     <w:p>
@@ -11171,6 +11225,7 @@
       </w:r>
     </w:p>
     <w:sectPr>
+      <w:headerReference w:type="default" r:id="rId6"/>
       <w:footerReference w:type="default" r:id="rId3"/>
       <w:footerReference w:type="first" r:id="rId4"/>
       <w:pgSz w:w="12240" w:h="15840"/>
@@ -11293,6 +11348,71 @@
 <w:ftr xmlns:w="http://schemas.openxmlformats.org/wordprocessingml/2006/main">
   <w:p/>
 </w:ftr>
+</file>
+
+<file path=word/header1.xml><?xml version="1.0" encoding="utf-8"?>
+<w:hdr xmlns:w="http://schemas.openxmlformats.org/wordprocessingml/2006/main" xmlns:r="http://schemas.openxmlformats.org/officeDocument/2006/relationships">
+  <w:p>
+    <w:pPr>
+      <w:pBdr>
+        <w:bottom w:val="single" w:sz="4" w:space="2" w:color="BFBFBF"/>
+      </w:pBdr>
+      <w:tabs>
+        <w:tab w:val="right" w:pos="9360"/>
+      </w:tabs>
+      <w:spacing w:before="0" w:after="0" w:line="240" w:lineRule="auto"/>
+      <w:jc w:val="left"/>
+    </w:pPr>
+    <w:r>
+      <w:drawing>
+        <wp:inline xmlns:wp="http://schemas.openxmlformats.org/drawingml/2006/wordprocessingDrawing" distT="0" distB="0" distL="0" distR="0">
+          <wp:extent cx="880000" cy="196997"/>
+          <wp:effectExtent l="0" t="0" r="0" b="0"/>
+          <wp:docPr id="1" name="logo-duoc-header"/>
+          <wp:cNvGraphicFramePr>
+            <a:graphicFrameLocks xmlns:a="http://schemas.openxmlformats.org/drawingml/2006/main" noChangeAspect="1"/>
+          </wp:cNvGraphicFramePr>
+          <a:graphic xmlns:a="http://schemas.openxmlformats.org/drawingml/2006/main">
+            <a:graphicData uri="http://schemas.openxmlformats.org/drawingml/2006/picture">
+              <pic:pic xmlns:pic="http://schemas.openxmlformats.org/drawingml/2006/picture">
+                <pic:nvPicPr>
+                  <pic:cNvPr id="1" name="logo-duoc-header"/>
+                  <pic:cNvPicPr/>
+                </pic:nvPicPr>
+                <pic:blipFill>
+                  <a:blip r:embed="rId1"/>
+                  <a:stretch>
+                    <a:fillRect/>
+                  </a:stretch>
+                </pic:blipFill>
+                <pic:spPr>
+                  <a:xfrm>
+                    <a:off x="0" y="0"/>
+                    <a:ext cx="880000" cy="196997"/>
+                  </a:xfrm>
+                  <a:prstGeom prst="rect">
+                    <a:avLst/>
+                  </a:prstGeom>
+                </pic:spPr>
+              </pic:pic>
+            </a:graphicData>
+          </a:graphic>
+        </wp:inline>
+      </w:drawing>
+    </w:r>
+    <w:r>
+      <w:tab/>
+    </w:r>
+    <w:r>
+      <w:rPr>
+        <w:rFonts w:ascii="Arial" w:hAnsi="Arial"/>
+        <w:sz w:val="16"/>
+        <w:color w:val="808080"/>
+      </w:rPr>
+      <w:t xml:space="preserve">Capstone (PTY4614) · Informe de Avance Proyecto APT — Fase 2</w:t>
+    </w:r>
+  </w:p>
+</w:hdr>
 </file>
 
 <file path=word/numbering.xml><?xml version="1.0" encoding="utf-8"?>
@@ -11495,6 +11615,20 @@
       <w:sz w:val="24"/>
     </w:rPr>
   </w:style>
+  <w:style w:type="paragraph" w:styleId="CoverTagline">
+    <w:name w:val="CoverTagline"/>
+    <w:basedOn w:val="Normal"/>
+    <w:pPr>
+      <w:jc w:val="center"/>
+      <w:spacing w:before="0" w:after="240"/>
+    </w:pPr>
+    <w:rPr>
+      <w:rFonts w:ascii="Arial" w:hAnsi="Arial"/>
+      <w:i/>
+      <w:color w:val="404040"/>
+      <w:sz w:val="22"/>
+    </w:rPr>
+  </w:style>
   <w:style w:type="paragraph" w:styleId="CoverLine">
     <w:name w:val="CoverLine"/>
     <w:basedOn w:val="Normal"/>

</xml_diff>